<commit_message>
Add standalone OpenRouter agent and WSL2 Chrome integration
- Add create-book.py: LLM-powered agent using free OpenRouter models
  with auto venv activation, URL deduplication, and --no-llm fallback
- Add chrome_extract.ps1: PowerShell CDP script to bypass WSL2 firewall
- Update get_chrome_urls.py with WSL2 gateway discovery, multi-host
  scanning, and PowerShell fallback when direct CDP connection fails
- Add User-Agent header in script.py to fix blocked image downloads
- Update requirements.txt with openai and python-dotenv
- Update CLAUDE.md and .gitignore

Co-Authored-By: Claude Opus 4.6 <noreply@anthropic.com>
</commit_message>
<xml_diff>
--- a/Kawaii_Coloring_Book_Final.docx
+++ b/Kawaii_Coloring_Book_Final.docx
@@ -10,7 +10,7 @@
       <w:r>
         <w:drawing>
           <wp:inline xmlns:a="http://schemas.openxmlformats.org/drawingml/2006/main" xmlns:pic="http://schemas.openxmlformats.org/drawingml/2006/picture">
-            <wp:extent cx="4860000" cy="4860000"/>
+            <wp:extent cx="3344598" cy="4860000"/>
             <wp:docPr id="1" name="Picture 1"/>
             <wp:cNvGraphicFramePr>
               <a:graphicFrameLocks noChangeAspect="1"/>
@@ -31,217 +31,7 @@
                   <pic:spPr>
                     <a:xfrm>
                       <a:off x="0" y="0"/>
-                      <a:ext cx="4860000" cy="4860000"/>
-                    </a:xfrm>
-                    <a:prstGeom prst="rect"/>
-                  </pic:spPr>
-                </pic:pic>
-              </a:graphicData>
-            </a:graphic>
-          </wp:inline>
-        </w:drawing>
-      </w:r>
-    </w:p>
-    <w:p>
-      <w:pPr>
-        <w:spacing w:before="0" w:after="0" w:line="240" w:lineRule="auto"/>
-        <w:jc w:val="center"/>
-      </w:pPr>
-      <w:r>
-        <w:drawing>
-          <wp:inline xmlns:a="http://schemas.openxmlformats.org/drawingml/2006/main" xmlns:pic="http://schemas.openxmlformats.org/drawingml/2006/picture">
-            <wp:extent cx="3474570" cy="4860000"/>
-            <wp:docPr id="2" name="Picture 2"/>
-            <wp:cNvGraphicFramePr>
-              <a:graphicFrameLocks noChangeAspect="1"/>
-            </wp:cNvGraphicFramePr>
-            <a:graphic>
-              <a:graphicData uri="http://schemas.openxmlformats.org/drawingml/2006/picture">
-                <pic:pic>
-                  <pic:nvPicPr>
-                    <pic:cNvPr id="0" name="image.png"/>
-                    <pic:cNvPicPr/>
-                  </pic:nvPicPr>
-                  <pic:blipFill>
-                    <a:blip r:embed="rId10"/>
-                    <a:stretch>
-                      <a:fillRect/>
-                    </a:stretch>
-                  </pic:blipFill>
-                  <pic:spPr>
-                    <a:xfrm>
-                      <a:off x="0" y="0"/>
-                      <a:ext cx="3474570" cy="4860000"/>
-                    </a:xfrm>
-                    <a:prstGeom prst="rect"/>
-                  </pic:spPr>
-                </pic:pic>
-              </a:graphicData>
-            </a:graphic>
-          </wp:inline>
-        </w:drawing>
-      </w:r>
-    </w:p>
-    <w:p>
-      <w:r>
-        <w:br w:type="page"/>
-      </w:r>
-    </w:p>
-    <w:p>
-      <w:pPr>
-        <w:spacing w:before="0" w:after="0" w:line="240" w:lineRule="auto"/>
-        <w:jc w:val="center"/>
-      </w:pPr>
-      <w:r>
-        <w:drawing>
-          <wp:inline xmlns:a="http://schemas.openxmlformats.org/drawingml/2006/main" xmlns:pic="http://schemas.openxmlformats.org/drawingml/2006/picture">
-            <wp:extent cx="3757977" cy="4860000"/>
-            <wp:docPr id="3" name="Picture 3"/>
-            <wp:cNvGraphicFramePr>
-              <a:graphicFrameLocks noChangeAspect="1"/>
-            </wp:cNvGraphicFramePr>
-            <a:graphic>
-              <a:graphicData uri="http://schemas.openxmlformats.org/drawingml/2006/picture">
-                <pic:pic>
-                  <pic:nvPicPr>
-                    <pic:cNvPr id="0" name="image.png"/>
-                    <pic:cNvPicPr/>
-                  </pic:nvPicPr>
-                  <pic:blipFill>
-                    <a:blip r:embed="rId11"/>
-                    <a:stretch>
-                      <a:fillRect/>
-                    </a:stretch>
-                  </pic:blipFill>
-                  <pic:spPr>
-                    <a:xfrm>
-                      <a:off x="0" y="0"/>
-                      <a:ext cx="3757977" cy="4860000"/>
-                    </a:xfrm>
-                    <a:prstGeom prst="rect"/>
-                  </pic:spPr>
-                </pic:pic>
-              </a:graphicData>
-            </a:graphic>
-          </wp:inline>
-        </w:drawing>
-      </w:r>
-    </w:p>
-    <w:p>
-      <w:pPr>
-        <w:spacing w:before="0" w:after="0" w:line="240" w:lineRule="auto"/>
-        <w:jc w:val="center"/>
-      </w:pPr>
-      <w:r>
-        <w:drawing>
-          <wp:inline xmlns:a="http://schemas.openxmlformats.org/drawingml/2006/main" xmlns:pic="http://schemas.openxmlformats.org/drawingml/2006/picture">
-            <wp:extent cx="3650777" cy="4860000"/>
-            <wp:docPr id="4" name="Picture 4"/>
-            <wp:cNvGraphicFramePr>
-              <a:graphicFrameLocks noChangeAspect="1"/>
-            </wp:cNvGraphicFramePr>
-            <a:graphic>
-              <a:graphicData uri="http://schemas.openxmlformats.org/drawingml/2006/picture">
-                <pic:pic>
-                  <pic:nvPicPr>
-                    <pic:cNvPr id="0" name="image.png"/>
-                    <pic:cNvPicPr/>
-                  </pic:nvPicPr>
-                  <pic:blipFill>
-                    <a:blip r:embed="rId12"/>
-                    <a:stretch>
-                      <a:fillRect/>
-                    </a:stretch>
-                  </pic:blipFill>
-                  <pic:spPr>
-                    <a:xfrm>
-                      <a:off x="0" y="0"/>
-                      <a:ext cx="3650777" cy="4860000"/>
-                    </a:xfrm>
-                    <a:prstGeom prst="rect"/>
-                  </pic:spPr>
-                </pic:pic>
-              </a:graphicData>
-            </a:graphic>
-          </wp:inline>
-        </w:drawing>
-      </w:r>
-    </w:p>
-    <w:p>
-      <w:r>
-        <w:br w:type="page"/>
-      </w:r>
-    </w:p>
-    <w:p>
-      <w:pPr>
-        <w:spacing w:before="0" w:after="0" w:line="240" w:lineRule="auto"/>
-        <w:jc w:val="center"/>
-      </w:pPr>
-      <w:r>
-        <w:drawing>
-          <wp:inline xmlns:a="http://schemas.openxmlformats.org/drawingml/2006/main" xmlns:pic="http://schemas.openxmlformats.org/drawingml/2006/picture">
-            <wp:extent cx="3438269" cy="4860000"/>
-            <wp:docPr id="5" name="Picture 5"/>
-            <wp:cNvGraphicFramePr>
-              <a:graphicFrameLocks noChangeAspect="1"/>
-            </wp:cNvGraphicFramePr>
-            <a:graphic>
-              <a:graphicData uri="http://schemas.openxmlformats.org/drawingml/2006/picture">
-                <pic:pic>
-                  <pic:nvPicPr>
-                    <pic:cNvPr id="0" name="image.png"/>
-                    <pic:cNvPicPr/>
-                  </pic:nvPicPr>
-                  <pic:blipFill>
-                    <a:blip r:embed="rId13"/>
-                    <a:stretch>
-                      <a:fillRect/>
-                    </a:stretch>
-                  </pic:blipFill>
-                  <pic:spPr>
-                    <a:xfrm>
-                      <a:off x="0" y="0"/>
-                      <a:ext cx="3438269" cy="4860000"/>
-                    </a:xfrm>
-                    <a:prstGeom prst="rect"/>
-                  </pic:spPr>
-                </pic:pic>
-              </a:graphicData>
-            </a:graphic>
-          </wp:inline>
-        </w:drawing>
-      </w:r>
-    </w:p>
-    <w:p>
-      <w:pPr>
-        <w:spacing w:before="0" w:after="0" w:line="240" w:lineRule="auto"/>
-        <w:jc w:val="center"/>
-      </w:pPr>
-      <w:r>
-        <w:drawing>
-          <wp:inline xmlns:a="http://schemas.openxmlformats.org/drawingml/2006/main" xmlns:pic="http://schemas.openxmlformats.org/drawingml/2006/picture">
-            <wp:extent cx="4860000" cy="4860000"/>
-            <wp:docPr id="6" name="Picture 6"/>
-            <wp:cNvGraphicFramePr>
-              <a:graphicFrameLocks noChangeAspect="1"/>
-            </wp:cNvGraphicFramePr>
-            <a:graphic>
-              <a:graphicData uri="http://schemas.openxmlformats.org/drawingml/2006/picture">
-                <pic:pic>
-                  <pic:nvPicPr>
-                    <pic:cNvPr id="0" name="image.png"/>
-                    <pic:cNvPicPr/>
-                  </pic:nvPicPr>
-                  <pic:blipFill>
-                    <a:blip r:embed="rId14"/>
-                    <a:stretch>
-                      <a:fillRect/>
-                    </a:stretch>
-                  </pic:blipFill>
-                  <pic:spPr>
-                    <a:xfrm>
-                      <a:off x="0" y="0"/>
-                      <a:ext cx="4860000" cy="4860000"/>
+                      <a:ext cx="3344598" cy="4860000"/>
                     </a:xfrm>
                     <a:prstGeom prst="rect"/>
                   </pic:spPr>

</xml_diff>